<commit_message>
Merge About MD-Match and Physician Qualifications into one section in FAQ
Co-Authored-By: Claude Sonnet 4.6 <noreply@anthropic.com>
Claude-Session: https://claude.ai/code/session_0188S5gV4B6MZsUwpAz5KZFZ
</commit_message>
<xml_diff>
--- a/MD-Match-FAQ.docx
+++ b/MD-Match-FAQ.docx
@@ -84,7 +84,7 @@
         </w:rPr>
       </w:pPr>
       <w:r>
-        <w:t xml:space="preserve">About MD-Match &amp; Our Service</w:t>
+        <w:t xml:space="preserve">About MD-Match</w:t>
       </w:r>
     </w:p>
     <w:p>
@@ -178,34 +178,6 @@
           <w:szCs w:val="22"/>
         </w:rPr>
         <w:t xml:space="preserve">We typically find a compatible collaborating physician within 7 days of your request. We currently maintain a roster of available physicians in multiple specialties and states, allowing us to move quickly.</w:t>
-      </w:r>
-    </w:p>
-    <w:p>
-      <w:pPr>
-        <w:pBdr>
-          <w:bottom w:val="single" w:color="d0e2e2" w:sz="2" w:space="1"/>
-        </w:pBdr>
-        <w:spacing w:after="240" w:before="240"/>
-      </w:pPr>
-    </w:p>
-    <w:p>
-      <w:pPr>
-        <w:pStyle w:val="Heading1"/>
-        <w:pBdr>
-          <w:bottom w:val="single" w:color="c9a84c" w:sz="6" w:space="6"/>
-        </w:pBdr>
-        <w:spacing w:after="160" w:before="400"/>
-        <w:rPr>
-          <w:rFonts w:ascii="Calibri" w:cs="Calibri" w:eastAsia="Calibri" w:hAnsi="Calibri"/>
-          <w:b/>
-          <w:bCs/>
-          <w:color w:val="0b3535"/>
-          <w:sz w:val="28"/>
-          <w:szCs w:val="28"/>
-        </w:rPr>
-      </w:pPr>
-      <w:r>
-        <w:t xml:space="preserve">Physician Qualifications &amp; Background Checks</w:t>
       </w:r>
     </w:p>
     <w:p>

</xml_diff>

<commit_message>
Add contract signing Q&A to FAQ
Co-Authored-By: Claude Sonnet 4.6 <noreply@anthropic.com>
Claude-Session: https://claude.ai/code/session_0188S5gV4B6MZsUwpAz5KZFZ
</commit_message>
<xml_diff>
--- a/MD-Match-FAQ.docx
+++ b/MD-Match-FAQ.docx
@@ -389,6 +389,37 @@
       </w:pPr>
       <w:r>
         <w:t xml:space="preserve">Contract Terms &amp; Termination</w:t>
+      </w:r>
+    </w:p>
+    <w:p>
+      <w:pPr>
+        <w:spacing w:after="80" w:before="280"/>
+      </w:pPr>
+      <w:r>
+        <w:rPr>
+          <w:rFonts w:ascii="Calibri" w:cs="Calibri" w:eastAsia="Calibri" w:hAnsi="Calibri"/>
+          <w:b/>
+          <w:bCs/>
+          <w:color w:val="0b3535"/>
+          <w:sz w:val="24"/>
+          <w:szCs w:val="24"/>
+        </w:rPr>
+        <w:t xml:space="preserve">Q: When do I sign my contract?</w:t>
+      </w:r>
+    </w:p>
+    <w:p>
+      <w:pPr>
+        <w:spacing w:after="160" w:before="0"/>
+        <w:ind w:left="288"/>
+      </w:pPr>
+      <w:r>
+        <w:rPr>
+          <w:rFonts w:ascii="Calibri" w:cs="Calibri" w:eastAsia="Calibri" w:hAnsi="Calibri"/>
+          <w:color w:val="1a3333"/>
+          <w:sz w:val="22"/>
+          <w:szCs w:val="22"/>
+        </w:rPr>
+        <w:t xml:space="preserve">Pending your verbal or written approval of the collaboration offer, we will send the contract for review and signature via DocuSign.</w:t>
       </w:r>
     </w:p>
     <w:p>

</xml_diff>